<commit_message>
Build enterprise dispatch cockpit and Feishu AI loop
</commit_message>
<xml_diff>
--- a/提交材料/07_飞书功能模块说明.docx
+++ b/提交材料/07_飞书功能模块说明.docx
@@ -366,7 +366,7 @@
                 <w:rFonts w:ascii="Calibri" w:hAnsi="Calibri" w:eastAsia="Microsoft YaHei"/>
                 <w:sz w:val="18"/>
               </w:rPr>
-              <w:t>班后复盘写入Base，Aily读取授权知识源回答新人追问。</w:t>
+              <w:t>班后复盘写入Base，飞书AI读取授权知识源回答新人追问。</w:t>
             </w:r>
           </w:p>
         </w:tc>
@@ -518,7 +518,7 @@
                 <w:rFonts w:ascii="Calibri" w:hAnsi="Calibri" w:eastAsia="Microsoft YaHei"/>
                 <w:sz w:val="18"/>
               </w:rPr>
-              <w:t>Aily问答解释优化理由；Base汇总历史采纳效果、未采纳原因和收益归因；事件回调把执行结果反哺模型。</w:t>
+              <w:t>飞书AI解释优化理由并标注事实来源；Base汇总历史采纳效果、未采纳原因和收益归因；事件回调把执行结果反哺模型。</w:t>
             </w:r>
           </w:p>
         </w:tc>
@@ -648,7 +648,7 @@
                 <w:rFonts w:ascii="Calibri" w:hAnsi="Calibri" w:eastAsia="Microsoft YaHei"/>
                 <w:sz w:val="18"/>
               </w:rPr>
-              <w:t>多维表格沉淀班次事实、班长备注、驳回原因、执行偏差和异常处置；Aily基于授权知识源检索回答。</w:t>
+              <w:t>多维表格沉淀班次事实、班长备注、驳回原因、执行偏差和异常处置；飞书AI基于授权知识源检索回答。</w:t>
             </w:r>
           </w:p>
         </w:tc>
@@ -1080,7 +1080,7 @@
                 <w:rFonts w:ascii="Calibri" w:hAnsi="Calibri" w:eastAsia="Microsoft YaHei"/>
                 <w:sz w:val="18"/>
               </w:rPr>
-              <w:t>执行监督与决赛交付</w:t>
+              <w:t>执行监督</w:t>
             </w:r>
           </w:p>
         </w:tc>
@@ -1145,7 +1145,7 @@
                 <w:rFonts w:ascii="Calibri" w:hAnsi="Calibri" w:eastAsia="Microsoft YaHei"/>
                 <w:sz w:val="18"/>
               </w:rPr>
-              <w:t>Aily问答</w:t>
+              <w:t>飞书AI问答</w:t>
             </w:r>
           </w:p>
         </w:tc>
@@ -1187,7 +1187,7 @@
                 <w:rFonts w:ascii="Calibri" w:hAnsi="Calibri" w:eastAsia="Microsoft YaHei"/>
                 <w:sz w:val="18"/>
               </w:rPr>
-              <w:t>为什么升/降负荷、库存能撑多久、同类异常如何处置</w:t>
+              <w:t>结论、当前数值、边界、事实来源、责任人、复核时间</w:t>
             </w:r>
           </w:p>
         </w:tc>
@@ -1208,7 +1208,7 @@
                 <w:rFonts w:ascii="Calibri" w:hAnsi="Calibri" w:eastAsia="Microsoft YaHei"/>
                 <w:sz w:val="18"/>
               </w:rPr>
-              <w:t>只回答授权知识源，不绕过审批和安全规则。</w:t>
+              <w:t>无来源不回答，不绕过审批和安全规则。</w:t>
             </w:r>
           </w:p>
         </w:tc>
@@ -1371,7 +1371,7 @@
         <w:rPr>
           <w:rFonts w:ascii="Calibri" w:hAnsi="Calibri" w:eastAsia="Microsoft YaHei"/>
         </w:rPr>
-        <w:t>知识迭代：Aily和模型校准流程读取复盘样本，周度输出规则修订和停用条件检查。</w:t>
+        <w:t>知识迭代：飞书AI和模型校准流程读取复盘样本，周度输出规则修订和停用条件检查。</w:t>
       </w:r>
     </w:p>
     <w:p>
@@ -1417,7 +1417,7 @@
         <w:rPr>
           <w:rFonts w:ascii="Calibri" w:hAnsi="Calibri" w:eastAsia="Microsoft YaHei"/>
         </w:rPr>
-        <w:t>接口契约：data/feishu_integration_contract.json 保存卡片、审批、Base、Aily和事件回调的字段与幂等键设计。</w:t>
+        <w:t>接口契约：data/feishu_integration_contract.json 保存卡片、审批、Base、飞书AI回答与动作、事件回调的字段与幂等键设计。</w:t>
       </w:r>
     </w:p>
     <w:p>
@@ -1480,7 +1480,18 @@
         <w:rPr>
           <w:rFonts w:ascii="Calibri" w:hAnsi="Calibri" w:eastAsia="Microsoft YaHei"/>
         </w:rPr>
-        <w:t>企业真实部署时需要企业自建应用 App ID / App Secret、目标群机器人权限、审批定义 approval_code、多维表格读写权限、Aily知识源授权和事件订阅回调配置。密钥不写入前端仓库。</w:t>
+        <w:t>飞书护机场景执行任务：https://applink.feishu.cn/client/todo/detail?guid=6e519bf6-1b28-4b90-b4e5-3a82fde9e1cb</w:t>
+      </w:r>
+    </w:p>
+    <w:p>
+      <w:pPr>
+        <w:pStyle w:val="ListBullet"/>
+      </w:pPr>
+      <w:r>
+        <w:rPr>
+          <w:rFonts w:ascii="Calibri" w:hAnsi="Calibri" w:eastAsia="Microsoft YaHei"/>
+        </w:rPr>
+        <w:t>当前飞书用户已具备文档、Base、审批、任务、消息和Spark应用等授权；企业真实部署仍需目标群机器人范围、审批定义 approval_code、飞书AI知识源与工具动作配置、事件订阅回调和密钥托管。密钥不写入前端仓库。</w:t>
       </w:r>
     </w:p>
     <w:p>

</xml_diff>